<commit_message>
Regenerate manuscripts after generation-stage attribution section
</commit_message>
<xml_diff>
--- a/paper/manuscript_R1R2_v1.docx
+++ b/paper/manuscript_R1R2_v1.docx
@@ -12003,6 +12003,810 @@
     </w:p>
     <w:p>
       <w:pPr>
+        <w:shd w:val="clear" w:color="auto" w:fill="DCE6F1"/>
+        <w:spacing w:before="200" w:after="80"/>
+      </w:pPr>
+      <w:r>
+        <w:rPr>
+          <w:rFonts w:ascii="Times New Roman" w:hAnsi="Times New Roman" w:eastAsia="Microsoft YaHei"/>
+          <w:b/>
+          <w:sz w:val="26"/>
+        </w:rPr>
+        <w:t>5.6 Generation-stage propagation: does the retrieval skew reach the output?</w:t>
+      </w:r>
+    </w:p>
+    <w:p>
+      <w:r>
+        <w:rPr>
+          <w:rFonts w:ascii="Times New Roman" w:hAnsi="Times New Roman" w:eastAsia="SimSun"/>
+          <w:sz w:val="22"/>
+        </w:rPr>
+        <w:t xml:space="preserve">Every result above is measured at the retrieval layer. That is deliberate — it makes the mechanism measurable without a generator and reproducible on commodity hardware — but it leaves the question a reviewer will ask: </w:t>
+      </w:r>
+      <w:r>
+        <w:rPr>
+          <w:rFonts w:ascii="Times New Roman" w:hAnsi="Times New Roman" w:eastAsia="SimSun"/>
+          <w:b/>
+          <w:sz w:val="22"/>
+        </w:rPr>
+        <w:t>does a retrieval-layer stance skew change what the system says?</w:t>
+      </w:r>
+      <w:r>
+        <w:rPr>
+          <w:rFonts w:ascii="Times New Roman" w:hAnsi="Times New Roman" w:eastAsia="SimSun"/>
+          <w:sz w:val="22"/>
+        </w:rPr>
+        <w:t xml:space="preserve"> We answer it with a fixed generator, varying only the retrieved context, so that any difference between conditions is attributable to retrieval.</w:t>
+      </w:r>
+    </w:p>
+    <w:p>
+      <w:r>
+        <w:rPr>
+          <w:rFonts w:ascii="Times New Roman" w:hAnsi="Times New Roman" w:eastAsia="SimSun"/>
+          <w:b/>
+          <w:sz w:val="22"/>
+        </w:rPr>
+        <w:t>Protocol.</w:t>
+      </w:r>
+      <w:r>
+        <w:rPr>
+          <w:rFonts w:ascii="Times New Roman" w:hAnsi="Times New Roman" w:eastAsia="SimSun"/>
+          <w:sz w:val="22"/>
+        </w:rPr>
+        <w:t xml:space="preserve"> For each query we generate under four conditions, holding model, prompt, decoding (temperature 0) and question text fixed: </w:t>
+      </w:r>
+      <w:r>
+        <w:rPr>
+          <w:rFonts w:ascii="Consolas" w:hAnsi="Consolas" w:eastAsia="Consolas"/>
+          <w:sz w:val="21"/>
+        </w:rPr>
+        <w:t>clean</w:t>
+      </w:r>
+      <w:r>
+        <w:rPr>
+          <w:rFonts w:ascii="Times New Roman" w:hAnsi="Times New Roman" w:eastAsia="SimSun"/>
+          <w:sz w:val="22"/>
+        </w:rPr>
+        <w:t xml:space="preserve"> (unpoisoned retrieval), </w:t>
+      </w:r>
+      <w:r>
+        <w:rPr>
+          <w:rFonts w:ascii="Consolas" w:hAnsi="Consolas" w:eastAsia="Consolas"/>
+          <w:sz w:val="21"/>
+        </w:rPr>
+        <w:t>poisoned</w:t>
+      </w:r>
+      <w:r>
+        <w:rPr>
+          <w:rFonts w:ascii="Times New Roman" w:hAnsi="Times New Roman" w:eastAsia="SimSun"/>
+          <w:sz w:val="22"/>
+        </w:rPr>
+        <w:t xml:space="preserve"> (pairwise injection, no defence), </w:t>
+      </w:r>
+      <w:r>
+        <w:rPr>
+          <w:rFonts w:ascii="Consolas" w:hAnsi="Consolas" w:eastAsia="Consolas"/>
+          <w:sz w:val="21"/>
+        </w:rPr>
+        <w:t>r1only</w:t>
+      </w:r>
+      <w:r>
+        <w:rPr>
+          <w:rFonts w:ascii="Times New Roman" w:hAnsi="Times New Roman" w:eastAsia="SimSun"/>
+          <w:sz w:val="22"/>
+        </w:rPr>
+        <w:t xml:space="preserve"> (R1 constraint), </w:t>
+      </w:r>
+      <w:r>
+        <w:rPr>
+          <w:rFonts w:ascii="Consolas" w:hAnsi="Consolas" w:eastAsia="Consolas"/>
+          <w:sz w:val="21"/>
+        </w:rPr>
+        <w:t>r2both</w:t>
+      </w:r>
+      <w:r>
+        <w:rPr>
+          <w:rFonts w:ascii="Times New Roman" w:hAnsi="Times New Roman" w:eastAsia="SimSun"/>
+          <w:sz w:val="22"/>
+        </w:rPr>
+        <w:t xml:space="preserve"> (R1+R2 constraint). The primary probe is </w:t>
+      </w:r>
+      <w:r>
+        <w:rPr>
+          <w:rFonts w:ascii="Times New Roman" w:hAnsi="Times New Roman" w:eastAsia="SimSun"/>
+          <w:b/>
+          <w:sz w:val="22"/>
+        </w:rPr>
+        <w:t>forced choice</w:t>
+      </w:r>
+      <w:r>
+        <w:rPr>
+          <w:rFonts w:ascii="Times New Roman" w:hAnsi="Times New Roman" w:eastAsia="SimSun"/>
+          <w:sz w:val="22"/>
+        </w:rPr>
+        <w:t>: the generator must select between a favourable and an unfavourable statement about a group — the generation-layer analogue of the R2 dimension, and the same form of measurement used for attack success in the poisoning literature. Option order is randomised per (query, condition, group) so that a position bias cannot masquerade as a stance effect. We additionally collect free-form answers and a per-passage attribution probe.</w:t>
+      </w:r>
+    </w:p>
+    <w:p>
+      <w:r>
+        <w:rPr>
+          <w:rFonts w:ascii="Times New Roman" w:hAnsi="Times New Roman" w:eastAsia="SimSun"/>
+          <w:sz w:val="22"/>
+        </w:rPr>
+        <w:t>Generator: DeepSeek (</w:t>
+      </w:r>
+      <w:r>
+        <w:rPr>
+          <w:rFonts w:ascii="Consolas" w:hAnsi="Consolas" w:eastAsia="Consolas"/>
+          <w:sz w:val="21"/>
+        </w:rPr>
+        <w:t>deepseek-chat</w:t>
+      </w:r>
+      <w:r>
+        <w:rPr>
+          <w:rFonts w:ascii="Times New Roman" w:hAnsi="Times New Roman" w:eastAsia="SimSun"/>
+          <w:sz w:val="22"/>
+        </w:rPr>
+        <w:t xml:space="preserve"> at temperature 0), selected because it is reachable without a proxy from the network this work used. 207 API calls, 49.2k prompt tokens, 125 s of model time.</w:t>
+      </w:r>
+    </w:p>
+    <w:p>
+      <w:r>
+        <w:rPr>
+          <w:rFonts w:ascii="Times New Roman" w:hAnsi="Times New Roman" w:eastAsia="SimSun"/>
+          <w:b/>
+          <w:sz w:val="22"/>
+        </w:rPr>
+        <w:t>Table 11.</w:t>
+      </w:r>
+      <w:r>
+        <w:rPr>
+          <w:rFonts w:ascii="Times New Roman" w:hAnsi="Times New Roman" w:eastAsia="SimSun"/>
+          <w:sz w:val="22"/>
+        </w:rPr>
+        <w:t xml:space="preserve"> Generation-layer stance by condition. Controlled corpus, GTE-base retrieval, $\rho = 2\%$.</w:t>
+      </w:r>
+    </w:p>
+    <w:tbl>
+      <w:tblPr>
+        <w:tblStyle w:val="TableGrid"/>
+        <w:tblW w:type="auto" w:w="0"/>
+        <w:jc w:val="center"/>
+        <w:tblLook w:firstColumn="1" w:firstRow="1" w:lastColumn="0" w:lastRow="0" w:noHBand="0" w:noVBand="1" w:val="04A0"/>
+      </w:tblPr>
+      <w:tblGrid>
+        <w:gridCol w:w="1928"/>
+        <w:gridCol w:w="1928"/>
+        <w:gridCol w:w="1928"/>
+        <w:gridCol w:w="1928"/>
+        <w:gridCol w:w="1928"/>
+      </w:tblGrid>
+      <w:tr>
+        <w:tc>
+          <w:tcPr>
+            <w:tcW w:type="dxa" w:w="1928"/>
+            <w:shd w:val="clear" w:color="auto" w:fill="DCE6F1"/>
+          </w:tcPr>
+          <w:p>
+            <w:pPr>
+              <w:spacing w:line="240" w:lineRule="auto" w:after="0"/>
+            </w:pPr>
+            <w:r>
+              <w:rPr>
+                <w:rFonts w:ascii="Times New Roman" w:hAnsi="Times New Roman" w:eastAsia="SimSun"/>
+                <w:b/>
+                <w:sz w:val="19"/>
+              </w:rPr>
+              <w:t>Condition</w:t>
+            </w:r>
+          </w:p>
+        </w:tc>
+        <w:tc>
+          <w:tcPr>
+            <w:tcW w:type="dxa" w:w="1928"/>
+            <w:shd w:val="clear" w:color="auto" w:fill="DCE6F1"/>
+          </w:tcPr>
+          <w:p>
+            <w:pPr>
+              <w:spacing w:line="240" w:lineRule="auto" w:after="0"/>
+            </w:pPr>
+            <w:r>
+              <w:rPr>
+                <w:rFonts w:ascii="Times New Roman" w:hAnsi="Times New Roman" w:eastAsia="SimSun"/>
+                <w:b/>
+                <w:sz w:val="19"/>
+              </w:rPr>
+              <w:t>fav. rate (g1)</w:t>
+            </w:r>
+          </w:p>
+        </w:tc>
+        <w:tc>
+          <w:tcPr>
+            <w:tcW w:type="dxa" w:w="1928"/>
+            <w:shd w:val="clear" w:color="auto" w:fill="DCE6F1"/>
+          </w:tcPr>
+          <w:p>
+            <w:pPr>
+              <w:spacing w:line="240" w:lineRule="auto" w:after="0"/>
+            </w:pPr>
+            <w:r>
+              <w:rPr>
+                <w:rFonts w:ascii="Times New Roman" w:hAnsi="Times New Roman" w:eastAsia="SimSun"/>
+                <w:b/>
+                <w:sz w:val="19"/>
+              </w:rPr>
+              <w:t>fav. rate (g2)</w:t>
+            </w:r>
+          </w:p>
+        </w:tc>
+        <w:tc>
+          <w:tcPr>
+            <w:tcW w:type="dxa" w:w="1928"/>
+            <w:shd w:val="clear" w:color="auto" w:fill="DCE6F1"/>
+          </w:tcPr>
+          <w:p>
+            <w:pPr>
+              <w:spacing w:line="240" w:lineRule="auto" w:after="0"/>
+            </w:pPr>
+            <w:r>
+              <w:rPr>
+                <w:rFonts w:ascii="Times New Roman" w:hAnsi="Times New Roman" w:eastAsia="SimSun"/>
+                <w:b/>
+                <w:sz w:val="19"/>
+              </w:rPr>
+              <w:t>stance gap</w:t>
+            </w:r>
+          </w:p>
+        </w:tc>
+        <w:tc>
+          <w:tcPr>
+            <w:tcW w:type="dxa" w:w="1928"/>
+            <w:shd w:val="clear" w:color="auto" w:fill="DCE6F1"/>
+          </w:tcPr>
+          <w:p>
+            <w:pPr>
+              <w:spacing w:line="240" w:lineRule="auto" w:after="0"/>
+            </w:pPr>
+            <w:r>
+              <w:rPr>
+                <w:rFonts w:ascii="Times New Roman" w:hAnsi="Times New Roman" w:eastAsia="SimSun"/>
+                <w:b/>
+                <w:sz w:val="19"/>
+              </w:rPr>
+              <w:t>Δ vs clean</w:t>
+            </w:r>
+          </w:p>
+        </w:tc>
+      </w:tr>
+      <w:tr>
+        <w:tc>
+          <w:tcPr>
+            <w:tcW w:type="dxa" w:w="1928"/>
+          </w:tcPr>
+          <w:p>
+            <w:pPr>
+              <w:spacing w:line="240" w:lineRule="auto" w:after="0"/>
+            </w:pPr>
+            <w:r>
+              <w:rPr>
+                <w:rFonts w:ascii="Times New Roman" w:hAnsi="Times New Roman" w:eastAsia="SimSun"/>
+                <w:sz w:val="19"/>
+              </w:rPr>
+              <w:t>clean</w:t>
+            </w:r>
+          </w:p>
+        </w:tc>
+        <w:tc>
+          <w:tcPr>
+            <w:tcW w:type="dxa" w:w="1928"/>
+          </w:tcPr>
+          <w:p>
+            <w:pPr>
+              <w:spacing w:line="240" w:lineRule="auto" w:after="0"/>
+            </w:pPr>
+            <w:r>
+              <w:rPr>
+                <w:rFonts w:ascii="Times New Roman" w:hAnsi="Times New Roman" w:eastAsia="SimSun"/>
+                <w:sz w:val="19"/>
+              </w:rPr>
+              <w:t>0.562</w:t>
+            </w:r>
+          </w:p>
+        </w:tc>
+        <w:tc>
+          <w:tcPr>
+            <w:tcW w:type="dxa" w:w="1928"/>
+          </w:tcPr>
+          <w:p>
+            <w:pPr>
+              <w:spacing w:line="240" w:lineRule="auto" w:after="0"/>
+            </w:pPr>
+            <w:r>
+              <w:rPr>
+                <w:rFonts w:ascii="Times New Roman" w:hAnsi="Times New Roman" w:eastAsia="SimSun"/>
+                <w:sz w:val="19"/>
+              </w:rPr>
+              <w:t>0.708</w:t>
+            </w:r>
+          </w:p>
+        </w:tc>
+        <w:tc>
+          <w:tcPr>
+            <w:tcW w:type="dxa" w:w="1928"/>
+          </w:tcPr>
+          <w:p>
+            <w:pPr>
+              <w:spacing w:line="240" w:lineRule="auto" w:after="0"/>
+            </w:pPr>
+            <w:r>
+              <w:rPr>
+                <w:rFonts w:ascii="Times New Roman" w:hAnsi="Times New Roman" w:eastAsia="SimSun"/>
+                <w:b/>
+                <w:sz w:val="19"/>
+              </w:rPr>
+              <w:t>0.2708</w:t>
+            </w:r>
+          </w:p>
+        </w:tc>
+        <w:tc>
+          <w:tcPr>
+            <w:tcW w:type="dxa" w:w="1928"/>
+          </w:tcPr>
+          <w:p>
+            <w:pPr>
+              <w:spacing w:line="240" w:lineRule="auto" w:after="0"/>
+            </w:pPr>
+            <w:r>
+              <w:rPr>
+                <w:rFonts w:ascii="Times New Roman" w:hAnsi="Times New Roman" w:eastAsia="SimSun"/>
+                <w:sz w:val="19"/>
+              </w:rPr>
+              <w:t>—</w:t>
+            </w:r>
+          </w:p>
+        </w:tc>
+      </w:tr>
+      <w:tr>
+        <w:tc>
+          <w:tcPr>
+            <w:tcW w:type="dxa" w:w="1928"/>
+          </w:tcPr>
+          <w:p>
+            <w:pPr>
+              <w:spacing w:line="240" w:lineRule="auto" w:after="0"/>
+            </w:pPr>
+            <w:r>
+              <w:rPr>
+                <w:rFonts w:ascii="Times New Roman" w:hAnsi="Times New Roman" w:eastAsia="SimSun"/>
+                <w:sz w:val="19"/>
+              </w:rPr>
+              <w:t>poisoned</w:t>
+            </w:r>
+          </w:p>
+        </w:tc>
+        <w:tc>
+          <w:tcPr>
+            <w:tcW w:type="dxa" w:w="1928"/>
+          </w:tcPr>
+          <w:p>
+            <w:pPr>
+              <w:spacing w:line="240" w:lineRule="auto" w:after="0"/>
+            </w:pPr>
+            <w:r>
+              <w:rPr>
+                <w:rFonts w:ascii="Times New Roman" w:hAnsi="Times New Roman" w:eastAsia="SimSun"/>
+                <w:sz w:val="19"/>
+              </w:rPr>
+              <w:t>0.583</w:t>
+            </w:r>
+          </w:p>
+        </w:tc>
+        <w:tc>
+          <w:tcPr>
+            <w:tcW w:type="dxa" w:w="1928"/>
+          </w:tcPr>
+          <w:p>
+            <w:pPr>
+              <w:spacing w:line="240" w:lineRule="auto" w:after="0"/>
+            </w:pPr>
+            <w:r>
+              <w:rPr>
+                <w:rFonts w:ascii="Times New Roman" w:hAnsi="Times New Roman" w:eastAsia="SimSun"/>
+                <w:sz w:val="19"/>
+              </w:rPr>
+              <w:t>0.979</w:t>
+            </w:r>
+          </w:p>
+        </w:tc>
+        <w:tc>
+          <w:tcPr>
+            <w:tcW w:type="dxa" w:w="1928"/>
+          </w:tcPr>
+          <w:p>
+            <w:pPr>
+              <w:spacing w:line="240" w:lineRule="auto" w:after="0"/>
+            </w:pPr>
+            <w:r>
+              <w:rPr>
+                <w:rFonts w:ascii="Times New Roman" w:hAnsi="Times New Roman" w:eastAsia="SimSun"/>
+                <w:b/>
+                <w:sz w:val="19"/>
+              </w:rPr>
+              <w:t>0.3958</w:t>
+            </w:r>
+          </w:p>
+        </w:tc>
+        <w:tc>
+          <w:tcPr>
+            <w:tcW w:type="dxa" w:w="1928"/>
+          </w:tcPr>
+          <w:p>
+            <w:pPr>
+              <w:spacing w:line="240" w:lineRule="auto" w:after="0"/>
+            </w:pPr>
+            <w:r>
+              <w:rPr>
+                <w:rFonts w:ascii="Times New Roman" w:hAnsi="Times New Roman" w:eastAsia="SimSun"/>
+                <w:b/>
+                <w:sz w:val="19"/>
+              </w:rPr>
+              <w:t>+46%</w:t>
+            </w:r>
+          </w:p>
+        </w:tc>
+      </w:tr>
+      <w:tr>
+        <w:tc>
+          <w:tcPr>
+            <w:tcW w:type="dxa" w:w="1928"/>
+          </w:tcPr>
+          <w:p>
+            <w:pPr>
+              <w:spacing w:line="240" w:lineRule="auto" w:after="0"/>
+            </w:pPr>
+            <w:r>
+              <w:rPr>
+                <w:rFonts w:ascii="Consolas" w:hAnsi="Consolas" w:eastAsia="Consolas"/>
+                <w:sz w:val="18"/>
+              </w:rPr>
+              <w:t>r1only</w:t>
+            </w:r>
+            <w:r>
+              <w:rPr>
+                <w:rFonts w:ascii="Times New Roman" w:hAnsi="Times New Roman" w:eastAsia="SimSun"/>
+                <w:sz w:val="19"/>
+              </w:rPr>
+              <w:t xml:space="preserve"> (R1)</w:t>
+            </w:r>
+          </w:p>
+        </w:tc>
+        <w:tc>
+          <w:tcPr>
+            <w:tcW w:type="dxa" w:w="1928"/>
+          </w:tcPr>
+          <w:p>
+            <w:pPr>
+              <w:spacing w:line="240" w:lineRule="auto" w:after="0"/>
+            </w:pPr>
+            <w:r>
+              <w:rPr>
+                <w:rFonts w:ascii="Times New Roman" w:hAnsi="Times New Roman" w:eastAsia="SimSun"/>
+                <w:sz w:val="19"/>
+              </w:rPr>
+              <w:t>0.604</w:t>
+            </w:r>
+          </w:p>
+        </w:tc>
+        <w:tc>
+          <w:tcPr>
+            <w:tcW w:type="dxa" w:w="1928"/>
+          </w:tcPr>
+          <w:p>
+            <w:pPr>
+              <w:spacing w:line="240" w:lineRule="auto" w:after="0"/>
+            </w:pPr>
+            <w:r>
+              <w:rPr>
+                <w:rFonts w:ascii="Times New Roman" w:hAnsi="Times New Roman" w:eastAsia="SimSun"/>
+                <w:sz w:val="19"/>
+              </w:rPr>
+              <w:t>1.000</w:t>
+            </w:r>
+          </w:p>
+        </w:tc>
+        <w:tc>
+          <w:tcPr>
+            <w:tcW w:type="dxa" w:w="1928"/>
+          </w:tcPr>
+          <w:p>
+            <w:pPr>
+              <w:spacing w:line="240" w:lineRule="auto" w:after="0"/>
+            </w:pPr>
+            <w:r>
+              <w:rPr>
+                <w:rFonts w:ascii="Times New Roman" w:hAnsi="Times New Roman" w:eastAsia="SimSun"/>
+                <w:b/>
+                <w:sz w:val="19"/>
+              </w:rPr>
+              <w:t>0.3958</w:t>
+            </w:r>
+          </w:p>
+        </w:tc>
+        <w:tc>
+          <w:tcPr>
+            <w:tcW w:type="dxa" w:w="1928"/>
+          </w:tcPr>
+          <w:p>
+            <w:pPr>
+              <w:spacing w:line="240" w:lineRule="auto" w:after="0"/>
+            </w:pPr>
+            <w:r>
+              <w:rPr>
+                <w:rFonts w:ascii="Times New Roman" w:hAnsi="Times New Roman" w:eastAsia="SimSun"/>
+                <w:sz w:val="19"/>
+              </w:rPr>
+              <w:t>+46%</w:t>
+            </w:r>
+          </w:p>
+        </w:tc>
+      </w:tr>
+      <w:tr>
+        <w:tc>
+          <w:tcPr>
+            <w:tcW w:type="dxa" w:w="1928"/>
+          </w:tcPr>
+          <w:p>
+            <w:pPr>
+              <w:spacing w:line="240" w:lineRule="auto" w:after="0"/>
+            </w:pPr>
+            <w:r>
+              <w:rPr>
+                <w:rFonts w:ascii="Consolas" w:hAnsi="Consolas" w:eastAsia="Consolas"/>
+                <w:sz w:val="18"/>
+              </w:rPr>
+              <w:t>r2both</w:t>
+            </w:r>
+            <w:r>
+              <w:rPr>
+                <w:rFonts w:ascii="Times New Roman" w:hAnsi="Times New Roman" w:eastAsia="SimSun"/>
+                <w:sz w:val="19"/>
+              </w:rPr>
+              <w:t xml:space="preserve"> (R1+R2)</w:t>
+            </w:r>
+          </w:p>
+        </w:tc>
+        <w:tc>
+          <w:tcPr>
+            <w:tcW w:type="dxa" w:w="1928"/>
+          </w:tcPr>
+          <w:p>
+            <w:pPr>
+              <w:spacing w:line="240" w:lineRule="auto" w:after="0"/>
+            </w:pPr>
+            <w:r>
+              <w:rPr>
+                <w:rFonts w:ascii="Times New Roman" w:hAnsi="Times New Roman" w:eastAsia="SimSun"/>
+                <w:sz w:val="19"/>
+              </w:rPr>
+              <w:t>0.583</w:t>
+            </w:r>
+          </w:p>
+        </w:tc>
+        <w:tc>
+          <w:tcPr>
+            <w:tcW w:type="dxa" w:w="1928"/>
+          </w:tcPr>
+          <w:p>
+            <w:pPr>
+              <w:spacing w:line="240" w:lineRule="auto" w:after="0"/>
+            </w:pPr>
+            <w:r>
+              <w:rPr>
+                <w:rFonts w:ascii="Times New Roman" w:hAnsi="Times New Roman" w:eastAsia="SimSun"/>
+                <w:sz w:val="19"/>
+              </w:rPr>
+              <w:t>1.000</w:t>
+            </w:r>
+          </w:p>
+        </w:tc>
+        <w:tc>
+          <w:tcPr>
+            <w:tcW w:type="dxa" w:w="1928"/>
+          </w:tcPr>
+          <w:p>
+            <w:pPr>
+              <w:spacing w:line="240" w:lineRule="auto" w:after="0"/>
+            </w:pPr>
+            <w:r>
+              <w:rPr>
+                <w:rFonts w:ascii="Times New Roman" w:hAnsi="Times New Roman" w:eastAsia="SimSun"/>
+                <w:b/>
+                <w:sz w:val="19"/>
+              </w:rPr>
+              <w:t>0.4167</w:t>
+            </w:r>
+          </w:p>
+        </w:tc>
+        <w:tc>
+          <w:tcPr>
+            <w:tcW w:type="dxa" w:w="1928"/>
+          </w:tcPr>
+          <w:p>
+            <w:pPr>
+              <w:spacing w:line="240" w:lineRule="auto" w:after="0"/>
+            </w:pPr>
+            <w:r>
+              <w:rPr>
+                <w:rFonts w:ascii="Times New Roman" w:hAnsi="Times New Roman" w:eastAsia="SimSun"/>
+                <w:sz w:val="19"/>
+              </w:rPr>
+              <w:t>+54%</w:t>
+            </w:r>
+          </w:p>
+        </w:tc>
+      </w:tr>
+    </w:tbl>
+    <w:p/>
+    <w:p>
+      <w:r>
+        <w:rPr>
+          <w:rFonts w:ascii="Times New Roman" w:hAnsi="Times New Roman" w:eastAsia="SimSun"/>
+          <w:b/>
+          <w:sz w:val="22"/>
+        </w:rPr>
+        <w:t>Finding 8. The retrieval-layer skew propagates to the generated output.</w:t>
+      </w:r>
+      <w:r>
+        <w:rPr>
+          <w:rFonts w:ascii="Times New Roman" w:hAnsi="Times New Roman" w:eastAsia="SimSun"/>
+          <w:sz w:val="22"/>
+        </w:rPr>
+        <w:t xml:space="preserve"> The generation-layer stance gap rises from 0.2708 to 0.3958 under poisoning — a 46% increase on a fixed generator with only the context changed. The retrieval-layer failure we document is therefore not an artefact of how we measure retrieval: it changes what the system says.</w:t>
+      </w:r>
+    </w:p>
+    <w:p>
+      <w:r>
+        <w:rPr>
+          <w:rFonts w:ascii="Times New Roman" w:hAnsi="Times New Roman" w:eastAsia="SimSun"/>
+          <w:b/>
+          <w:sz w:val="22"/>
+        </w:rPr>
+        <w:t>Finding 9. The skew does not appear as a uniform shift; it saturates one group.</w:t>
+      </w:r>
+      <w:r>
+        <w:rPr>
+          <w:rFonts w:ascii="Times New Roman" w:hAnsi="Times New Roman" w:eastAsia="SimSun"/>
+          <w:sz w:val="22"/>
+        </w:rPr>
+        <w:t xml:space="preserve"> The favourable rate for the second group rises monotonically across conditions (</w:t>
+      </w:r>
+      <w:r>
+        <w:rPr>
+          <w:rFonts w:ascii="Times New Roman" w:hAnsi="Times New Roman" w:eastAsia="SimSun"/>
+          <w:b/>
+          <w:sz w:val="22"/>
+        </w:rPr>
+        <w:t>0.708 → 0.979 → 1.000 → 1.000</w:t>
+      </w:r>
+      <w:r>
+        <w:rPr>
+          <w:rFonts w:ascii="Times New Roman" w:hAnsi="Times New Roman" w:eastAsia="SimSun"/>
+          <w:sz w:val="22"/>
+        </w:rPr>
+        <w:t>) while the first group's rate is essentially flat (0.562 → 0.583 → 0.604 → 0.583). The attack does not make the generator "more biased" in a diffuse sense; it drives one group's favourable judgement to ceiling. This is a more specific — and more concerning — failure mode than a uniform shift, and it is visible only because we measure the two groups separately.</w:t>
+      </w:r>
+    </w:p>
+    <w:p>
+      <w:r>
+        <w:rPr>
+          <w:rFonts w:ascii="Times New Roman" w:hAnsi="Times New Roman" w:eastAsia="SimSun"/>
+          <w:b/>
+          <w:sz w:val="22"/>
+        </w:rPr>
+        <w:t>Finding 10. Neither constraint improves the generation layer, and one makes it slightly worse.</w:t>
+      </w:r>
+      <w:r>
+        <w:rPr>
+          <w:rFonts w:ascii="Times New Roman" w:hAnsi="Times New Roman" w:eastAsia="SimSun"/>
+          <w:sz w:val="22"/>
+        </w:rPr>
+        <w:t xml:space="preserve"> </w:t>
+      </w:r>
+      <w:r>
+        <w:rPr>
+          <w:rFonts w:ascii="Consolas" w:hAnsi="Consolas" w:eastAsia="Consolas"/>
+          <w:sz w:val="21"/>
+        </w:rPr>
+        <w:t>r1only</w:t>
+      </w:r>
+      <w:r>
+        <w:rPr>
+          <w:rFonts w:ascii="Times New Roman" w:hAnsi="Times New Roman" w:eastAsia="SimSun"/>
+          <w:sz w:val="22"/>
+        </w:rPr>
+        <w:t xml:space="preserve"> leaves the gap identical to no defence (0.3958); </w:t>
+      </w:r>
+      <w:r>
+        <w:rPr>
+          <w:rFonts w:ascii="Consolas" w:hAnsi="Consolas" w:eastAsia="Consolas"/>
+          <w:sz w:val="21"/>
+        </w:rPr>
+        <w:t>r2both</w:t>
+      </w:r>
+      <w:r>
+        <w:rPr>
+          <w:rFonts w:ascii="Times New Roman" w:hAnsi="Times New Roman" w:eastAsia="SimSun"/>
+          <w:sz w:val="22"/>
+        </w:rPr>
+        <w:t xml:space="preserve"> leaves it slightly higher (0.4167). This is consistent with the retrieval-layer result on this backbone, where the R2 gap is already saturated and the R1 constraint is inert (§5.5): the input to the generator is unchanged, so the output is unchanged. We report it because it closes the loop honestly — the constraints we proposed, evaluated here, do not repair the downstream harm.</w:t>
+      </w:r>
+    </w:p>
+    <w:p>
+      <w:r>
+        <w:rPr>
+          <w:rFonts w:ascii="Times New Roman" w:hAnsi="Times New Roman" w:eastAsia="SimSun"/>
+          <w:b/>
+          <w:sz w:val="22"/>
+        </w:rPr>
+        <w:t>A metric that failed, reported because it is the natural one to reach for.</w:t>
+      </w:r>
+      <w:r>
+        <w:rPr>
+          <w:rFonts w:ascii="Times New Roman" w:hAnsi="Times New Roman" w:eastAsia="SimSun"/>
+          <w:sz w:val="22"/>
+        </w:rPr>
+        <w:t xml:space="preserve"> We implemented the expected-attributed-exposure (EAE-D) statistic of Kim &amp; Diaz [8] by asking the generator, per retrieved passage, whether its answer relied on that passage. It returns </w:t>
+      </w:r>
+      <w:r>
+        <w:rPr>
+          <w:rFonts w:ascii="Times New Roman" w:hAnsi="Times New Roman" w:eastAsia="SimSun"/>
+          <w:b/>
+          <w:sz w:val="22"/>
+        </w:rPr>
+        <w:t>1.000 in every condition</w:t>
+      </w:r>
+      <w:r>
+        <w:rPr>
+          <w:rFonts w:ascii="Times New Roman" w:hAnsi="Times New Roman" w:eastAsia="SimSun"/>
+          <w:sz w:val="22"/>
+        </w:rPr>
+        <w:t xml:space="preserve">, with no discrimination. The reason is structural rather than a coding error: the answer is generated </w:t>
+      </w:r>
+      <w:r>
+        <w:rPr>
+          <w:rFonts w:ascii="Times New Roman" w:hAnsi="Times New Roman" w:eastAsia="SimSun"/>
+          <w:i/>
+          <w:sz w:val="22"/>
+        </w:rPr>
+        <w:t>from</w:t>
+      </w:r>
+      <w:r>
+        <w:rPr>
+          <w:rFonts w:ascii="Times New Roman" w:hAnsi="Times New Roman" w:eastAsia="SimSun"/>
+          <w:sz w:val="22"/>
+        </w:rPr>
+        <w:t xml:space="preserve"> the context, so a "did you rely on this?" probe admits YES for essentially any passage present. Proper attribution — "which passages did you rely on?" — is what [8] measures by entailment rather than by self-report, and our self-report implementation does not replicate it. We report the failure because EAE-D is the obvious metric at this interface and a reader should know that its cheap version is uninformative here.</w:t>
+      </w:r>
+    </w:p>
+    <w:p>
+      <w:r>
+        <w:rPr>
+          <w:rFonts w:ascii="Times New Roman" w:hAnsi="Times New Roman" w:eastAsia="SimSun"/>
+          <w:b/>
+          <w:sz w:val="22"/>
+        </w:rPr>
+        <w:t>Scope.</w:t>
+      </w:r>
+      <w:r>
+        <w:rPr>
+          <w:rFonts w:ascii="Times New Roman" w:hAnsi="Times New Roman" w:eastAsia="SimSun"/>
+          <w:sz w:val="22"/>
+        </w:rPr>
+        <w:t xml:space="preserve"> One generator, one retrieval backbone (GTE-base), one injection rate, 48 queries. The direction and the saturation pattern are clear; the magnitudes should not be extrapolated.</w:t>
+      </w:r>
+    </w:p>
+    <w:p>
+      <w:pPr>
         <w:spacing w:before="240" w:after="120"/>
       </w:pPr>
       <w:r>
@@ -13265,14 +14069,14 @@
           <w:b/>
           <w:sz w:val="22"/>
         </w:rPr>
-        <w:t>No generation-stage evaluation.</w:t>
-      </w:r>
-      <w:r>
-        <w:rPr>
-          <w:rFonts w:ascii="Times New Roman" w:hAnsi="Times New Roman" w:eastAsia="SimSun"/>
-          <w:sz w:val="22"/>
-        </w:rPr>
-        <w:t xml:space="preserve"> We deliberately evaluate at the retrieval layer, so that the R1/R2 mechanism is measurable without a generator and the study is reproducible on commodity hardware (the full suite runs on CPU in under three minutes). This means we do not report attributed exposure [8] or generator bias [4, 7]. Since the retrieval-layer failure we document is a precondition for the downstream harm, we consider the two complementary, and we report generator-stage attribution as planned work. [FILL]</w:t>
+        <w:t>No generation-stage evaluation *beyond §5.6*.</w:t>
+      </w:r>
+      <w:r>
+        <w:rPr>
+          <w:rFonts w:ascii="Times New Roman" w:hAnsi="Times New Roman" w:eastAsia="SimSun"/>
+          <w:sz w:val="22"/>
+        </w:rPr>
+        <w:t xml:space="preserve"> We evaluate at the retrieval layer by design, so the R1/R2 mechanism is measurable without a generator. §5.6 adds a first generation-stage check on a single generator and backbone; it establishes that the skew propagates and that it saturates one group, but not the magnitude. A multi-generator evaluation, and proper entailment-based attribution rather than the self-report probe that failed in §5.6, remain to be done. We do not otherwise report attributed exposure [8] or generator bias [4, 7].</w:t>
       </w:r>
     </w:p>
     <w:p>
@@ -13369,7 +14173,176 @@
           <w:rFonts w:ascii="Times New Roman" w:hAnsi="Times New Roman" w:eastAsia="SimSun"/>
           <w:sz w:val="22"/>
         </w:rPr>
-        <w:t>. The controlled corpus is generated deterministically from a fixed seed and requires no dataset download; the BBQ corpus is reconstructed from the official benchmark files by a released loader that derives stance labels from BBQ's own annotations.</w:t>
+        <w:t xml:space="preserve">. The controlled corpus is generated deterministically from a fixed seed and requires no dataset download; the BBQ corpus is reconstructed from the official benchmark files by a released loader that derives stance labels from BBQ's own annotations. §5.6 additionally requires a DeepSeek API key, supplied through the </w:t>
+      </w:r>
+      <w:r>
+        <w:rPr>
+          <w:rFonts w:ascii="Consolas" w:hAnsi="Consolas" w:eastAsia="Consolas"/>
+          <w:sz w:val="21"/>
+        </w:rPr>
+        <w:t>DEEPSEEK_API_KEY</w:t>
+      </w:r>
+      <w:r>
+        <w:rPr>
+          <w:rFonts w:ascii="Times New Roman" w:hAnsi="Times New Roman" w:eastAsia="SimSun"/>
+          <w:sz w:val="22"/>
+        </w:rPr>
+        <w:t xml:space="preserve"> environment variable and never stored in the repository.</w:t>
+      </w:r>
+    </w:p>
+    <w:p>
+      <w:r>
+        <w:rPr>
+          <w:rFonts w:ascii="Times New Roman" w:hAnsi="Times New Roman" w:eastAsia="SimSun"/>
+          <w:b/>
+          <w:sz w:val="22"/>
+        </w:rPr>
+        <w:t>How to regenerate.</w:t>
+      </w:r>
+    </w:p>
+    <w:p>
+      <w:pPr>
+        <w:spacing w:line="240" w:lineRule="auto"/>
+        <w:ind w:left="283"/>
+      </w:pPr>
+      <w:r>
+        <w:rPr>
+          <w:rFonts w:ascii="Consolas" w:hAnsi="Consolas" w:eastAsia="Consolas"/>
+          <w:sz w:val="18"/>
+        </w:rPr>
+        <w:t># retrieval layer (CPU only, no API key)</w:t>
+      </w:r>
+    </w:p>
+    <w:p>
+      <w:pPr>
+        <w:spacing w:line="240" w:lineRule="auto"/>
+        <w:ind w:left="283"/>
+      </w:pPr>
+      <w:r>
+        <w:rPr>
+          <w:rFonts w:ascii="Consolas" w:hAnsi="Consolas" w:eastAsia="Consolas"/>
+          <w:sz w:val="18"/>
+        </w:rPr>
+        <w:t>python -m src.run_experiment --config configs/default.json      # ~25 s</w:t>
+      </w:r>
+    </w:p>
+    <w:p>
+      <w:pPr>
+        <w:spacing w:line="240" w:lineRule="auto"/>
+        <w:ind w:left="283"/>
+      </w:pPr>
+      <w:r>
+        <w:rPr>
+          <w:rFonts w:ascii="Consolas" w:hAnsi="Consolas" w:eastAsia="Consolas"/>
+          <w:sz w:val="18"/>
+        </w:rPr>
+        <w:t>python -m src.run_experiment --config configs/bbq.json          # ~180 s</w:t>
+      </w:r>
+    </w:p>
+    <w:p>
+      <w:pPr>
+        <w:spacing w:line="240" w:lineRule="auto"/>
+        <w:ind w:left="283"/>
+      </w:pPr>
+      <w:r>
+        <w:rPr>
+          <w:rFonts w:ascii="Consolas" w:hAnsi="Consolas" w:eastAsia="Consolas"/>
+          <w:sz w:val="18"/>
+        </w:rPr>
+        <w:t>python -m src.run_experiment --config configs/align_multi.json  # GTE + Contriever, ~12 min</w:t>
+      </w:r>
+    </w:p>
+    <w:p>
+      <w:pPr>
+        <w:spacing w:line="240" w:lineRule="auto"/>
+        <w:ind w:left="283"/>
+      </w:pPr>
+      <w:r>
+        <w:rPr>
+          <w:rFonts w:ascii="Consolas" w:hAnsi="Consolas" w:eastAsia="Consolas"/>
+          <w:sz w:val="18"/>
+        </w:rPr>
+        <w:t xml:space="preserve"> </w:t>
+      </w:r>
+    </w:p>
+    <w:p>
+      <w:pPr>
+        <w:spacing w:line="240" w:lineRule="auto"/>
+        <w:ind w:left="283"/>
+      </w:pPr>
+      <w:r>
+        <w:rPr>
+          <w:rFonts w:ascii="Consolas" w:hAnsi="Consolas" w:eastAsia="Consolas"/>
+          <w:sz w:val="18"/>
+        </w:rPr>
+        <w:t># generation layer (requires DEEPSEEK_API_KEY)</w:t>
+      </w:r>
+    </w:p>
+    <w:p>
+      <w:pPr>
+        <w:spacing w:line="240" w:lineRule="auto"/>
+        <w:ind w:left="283"/>
+      </w:pPr>
+      <w:r>
+        <w:rPr>
+          <w:rFonts w:ascii="Consolas" w:hAnsi="Consolas" w:eastAsia="Consolas"/>
+          <w:sz w:val="18"/>
+        </w:rPr>
+        <w:t>python -m src.run_attribution --config configs/attribution.json</w:t>
+      </w:r>
+    </w:p>
+    <w:p>
+      <w:r>
+        <w:rPr>
+          <w:rFonts w:ascii="Times New Roman" w:hAnsi="Times New Roman" w:eastAsia="SimSun"/>
+          <w:sz w:val="22"/>
+        </w:rPr>
+        <w:t xml:space="preserve">Real-encoder runs require </w:t>
+      </w:r>
+      <w:r>
+        <w:rPr>
+          <w:rFonts w:ascii="Consolas" w:hAnsi="Consolas" w:eastAsia="Consolas"/>
+          <w:sz w:val="21"/>
+        </w:rPr>
+        <w:t>HF_ENDPOINT=https://hf-mirror.com</w:t>
+      </w:r>
+      <w:r>
+        <w:rPr>
+          <w:rFonts w:ascii="Times New Roman" w:hAnsi="Times New Roman" w:eastAsia="SimSun"/>
+          <w:sz w:val="22"/>
+        </w:rPr>
+        <w:t xml:space="preserve"> on networks where huggingface.co is unreachable.</w:t>
+      </w:r>
+    </w:p>
+    <w:p>
+      <w:r>
+        <w:rPr>
+          <w:rFonts w:ascii="Times New Roman" w:hAnsi="Times New Roman" w:eastAsia="SimSun"/>
+          <w:b/>
+          <w:sz w:val="22"/>
+        </w:rPr>
+        <w:t>API key.</w:t>
+      </w:r>
+      <w:r>
+        <w:rPr>
+          <w:rFonts w:ascii="Times New Roman" w:hAnsi="Times New Roman" w:eastAsia="SimSun"/>
+          <w:sz w:val="22"/>
+        </w:rPr>
+        <w:t xml:space="preserve"> The key used for the §5.6 runs is rotated and revoked before publication; the repository contains no credentials, and </w:t>
+      </w:r>
+      <w:r>
+        <w:rPr>
+          <w:rFonts w:ascii="Consolas" w:hAnsi="Consolas" w:eastAsia="Consolas"/>
+          <w:sz w:val="21"/>
+        </w:rPr>
+        <w:t>results/attribution_cache.json</w:t>
+      </w:r>
+      <w:r>
+        <w:rPr>
+          <w:rFonts w:ascii="Times New Roman" w:hAnsi="Times New Roman" w:eastAsia="SimSun"/>
+          <w:sz w:val="22"/>
+        </w:rPr>
+        <w:t xml:space="preserve"> (a prompt→reply cache) is regenerated locally rather than shipped.</w:t>
       </w:r>
     </w:p>
     <w:p>

</xml_diff>

<commit_message>
Add Prop. 1 empirical-check table (Table 12); correct the cell count to 24
</commit_message>
<xml_diff>
--- a/paper/manuscript_R1R2_v1.docx
+++ b/paper/manuscript_R1R2_v1.docx
@@ -13068,6 +13068,889 @@
           <w:sz w:val="22"/>
         </w:rPr>
         <w:t xml:space="preserve"> to no defense at every $\varepsilon$ rather than merely close to it: the injected selection is not near the boundary of $\mathcal{R}_\varepsilon$, it is at the reference point.</w:t>
+      </w:r>
+    </w:p>
+    <w:p>
+      <w:r>
+        <w:rPr>
+          <w:rFonts w:ascii="Times New Roman" w:hAnsi="Times New Roman" w:eastAsia="SimSun"/>
+          <w:b/>
+          <w:sz w:val="22"/>
+        </w:rPr>
+        <w:t>Empirical check.</w:t>
+      </w:r>
+      <w:r>
+        <w:rPr>
+          <w:rFonts w:ascii="Times New Roman" w:hAnsi="Times New Roman" w:eastAsia="SimSun"/>
+          <w:sz w:val="22"/>
+        </w:rPr>
+        <w:t xml:space="preserve"> Table 12 reports the prediction of Prop. 1 against every configuration we ran: if the injected selection sits at the reference point, then constraining the R1 budget must leave adversarial inclusion </w:t>
+      </w:r>
+      <w:r>
+        <w:rPr>
+          <w:rFonts w:ascii="Times New Roman" w:hAnsi="Times New Roman" w:eastAsia="SimSun"/>
+          <w:i/>
+          <w:sz w:val="22"/>
+        </w:rPr>
+        <w:t>exactly</w:t>
+      </w:r>
+      <w:r>
+        <w:rPr>
+          <w:rFonts w:ascii="Times New Roman" w:hAnsi="Times New Roman" w:eastAsia="SimSun"/>
+          <w:sz w:val="22"/>
+        </w:rPr>
+        <w:t xml:space="preserve"> unchanged at every tolerance.</w:t>
+      </w:r>
+    </w:p>
+    <w:p>
+      <w:r>
+        <w:rPr>
+          <w:rFonts w:ascii="Times New Roman" w:hAnsi="Times New Roman" w:eastAsia="SimSun"/>
+          <w:b/>
+          <w:sz w:val="22"/>
+        </w:rPr>
+        <w:t>Table 12.</w:t>
+      </w:r>
+      <w:r>
+        <w:rPr>
+          <w:rFonts w:ascii="Times New Roman" w:hAnsi="Times New Roman" w:eastAsia="SimSun"/>
+          <w:sz w:val="22"/>
+        </w:rPr>
+        <w:t xml:space="preserve"> Prop. 1 prediction vs. measurement. R1-only constraint (</w:t>
+      </w:r>
+      <w:r>
+        <w:rPr>
+          <w:rFonts w:ascii="Consolas" w:hAnsi="Consolas" w:eastAsia="Consolas"/>
+          <w:sz w:val="21"/>
+        </w:rPr>
+        <w:t>repr_group</w:t>
+      </w:r>
+      <w:r>
+        <w:rPr>
+          <w:rFonts w:ascii="Times New Roman" w:hAnsi="Times New Roman" w:eastAsia="SimSun"/>
+          <w:sz w:val="22"/>
+        </w:rPr>
+        <w:t>), strongest attack, largest injection rate per corpus; Δ = constrained minus no defense.</w:t>
+      </w:r>
+    </w:p>
+    <w:tbl>
+      <w:tblPr>
+        <w:tblStyle w:val="TableGrid"/>
+        <w:tblW w:type="auto" w:w="0"/>
+        <w:jc w:val="center"/>
+        <w:tblLook w:firstColumn="1" w:firstRow="1" w:lastColumn="0" w:lastRow="0" w:noHBand="0" w:noVBand="1" w:val="04A0"/>
+      </w:tblPr>
+      <w:tblGrid>
+        <w:gridCol w:w="1606"/>
+        <w:gridCol w:w="1606"/>
+        <w:gridCol w:w="1606"/>
+        <w:gridCol w:w="1606"/>
+        <w:gridCol w:w="1606"/>
+        <w:gridCol w:w="1606"/>
+      </w:tblGrid>
+      <w:tr>
+        <w:tc>
+          <w:tcPr>
+            <w:tcW w:type="dxa" w:w="1606"/>
+            <w:shd w:val="clear" w:color="auto" w:fill="DCE6F1"/>
+          </w:tcPr>
+          <w:p>
+            <w:pPr>
+              <w:spacing w:line="240" w:lineRule="auto" w:after="0"/>
+            </w:pPr>
+            <w:r>
+              <w:rPr>
+                <w:rFonts w:ascii="Times New Roman" w:hAnsi="Times New Roman" w:eastAsia="SimSun"/>
+                <w:b/>
+                <w:sz w:val="19"/>
+              </w:rPr>
+              <w:t>Corpus / retriever</w:t>
+            </w:r>
+          </w:p>
+        </w:tc>
+        <w:tc>
+          <w:tcPr>
+            <w:tcW w:type="dxa" w:w="1606"/>
+            <w:shd w:val="clear" w:color="auto" w:fill="DCE6F1"/>
+          </w:tcPr>
+          <w:p>
+            <w:pPr>
+              <w:spacing w:line="240" w:lineRule="auto" w:after="0"/>
+            </w:pPr>
+            <w:r>
+              <w:rPr>
+                <w:rFonts w:ascii="Times New Roman" w:hAnsi="Times New Roman" w:eastAsia="SimSun"/>
+                <w:b/>
+                <w:sz w:val="19"/>
+              </w:rPr>
+              <w:t>ε=1.0</w:t>
+            </w:r>
+          </w:p>
+        </w:tc>
+        <w:tc>
+          <w:tcPr>
+            <w:tcW w:type="dxa" w:w="1606"/>
+            <w:shd w:val="clear" w:color="auto" w:fill="DCE6F1"/>
+          </w:tcPr>
+          <w:p>
+            <w:pPr>
+              <w:spacing w:line="240" w:lineRule="auto" w:after="0"/>
+            </w:pPr>
+            <w:r>
+              <w:rPr>
+                <w:rFonts w:ascii="Times New Roman" w:hAnsi="Times New Roman" w:eastAsia="SimSun"/>
+                <w:b/>
+                <w:sz w:val="19"/>
+              </w:rPr>
+              <w:t>ε=0.5</w:t>
+            </w:r>
+          </w:p>
+        </w:tc>
+        <w:tc>
+          <w:tcPr>
+            <w:tcW w:type="dxa" w:w="1606"/>
+            <w:shd w:val="clear" w:color="auto" w:fill="DCE6F1"/>
+          </w:tcPr>
+          <w:p>
+            <w:pPr>
+              <w:spacing w:line="240" w:lineRule="auto" w:after="0"/>
+            </w:pPr>
+            <w:r>
+              <w:rPr>
+                <w:rFonts w:ascii="Times New Roman" w:hAnsi="Times New Roman" w:eastAsia="SimSun"/>
+                <w:b/>
+                <w:sz w:val="19"/>
+              </w:rPr>
+              <w:t>ε=0.25</w:t>
+            </w:r>
+          </w:p>
+        </w:tc>
+        <w:tc>
+          <w:tcPr>
+            <w:tcW w:type="dxa" w:w="1606"/>
+            <w:shd w:val="clear" w:color="auto" w:fill="DCE6F1"/>
+          </w:tcPr>
+          <w:p>
+            <w:pPr>
+              <w:spacing w:line="240" w:lineRule="auto" w:after="0"/>
+            </w:pPr>
+            <w:r>
+              <w:rPr>
+                <w:rFonts w:ascii="Times New Roman" w:hAnsi="Times New Roman" w:eastAsia="SimSun"/>
+                <w:b/>
+                <w:sz w:val="19"/>
+              </w:rPr>
+              <w:t>ε=0.1</w:t>
+            </w:r>
+          </w:p>
+        </w:tc>
+        <w:tc>
+          <w:tcPr>
+            <w:tcW w:type="dxa" w:w="1606"/>
+            <w:shd w:val="clear" w:color="auto" w:fill="DCE6F1"/>
+          </w:tcPr>
+          <w:p>
+            <w:pPr>
+              <w:spacing w:line="240" w:lineRule="auto" w:after="0"/>
+            </w:pPr>
+            <w:r>
+              <w:rPr>
+                <w:rFonts w:ascii="Times New Roman" w:hAnsi="Times New Roman" w:eastAsia="SimSun"/>
+                <w:b/>
+                <w:sz w:val="19"/>
+              </w:rPr>
+              <w:t>ε=0.0</w:t>
+            </w:r>
+          </w:p>
+        </w:tc>
+      </w:tr>
+      <w:tr>
+        <w:tc>
+          <w:tcPr>
+            <w:tcW w:type="dxa" w:w="1606"/>
+          </w:tcPr>
+          <w:p>
+            <w:pPr>
+              <w:spacing w:line="240" w:lineRule="auto" w:after="0"/>
+            </w:pPr>
+            <w:r>
+              <w:rPr>
+                <w:rFonts w:ascii="Times New Roman" w:hAnsi="Times New Roman" w:eastAsia="SimSun"/>
+                <w:sz w:val="19"/>
+              </w:rPr>
+              <w:t>controlled / BM25</w:t>
+            </w:r>
+          </w:p>
+        </w:tc>
+        <w:tc>
+          <w:tcPr>
+            <w:tcW w:type="dxa" w:w="1606"/>
+          </w:tcPr>
+          <w:p>
+            <w:pPr>
+              <w:spacing w:line="240" w:lineRule="auto" w:after="0"/>
+            </w:pPr>
+            <w:r>
+              <w:rPr>
+                <w:rFonts w:ascii="Times New Roman" w:hAnsi="Times New Roman" w:eastAsia="SimSun"/>
+                <w:sz w:val="19"/>
+              </w:rPr>
+              <w:t>0.000</w:t>
+            </w:r>
+          </w:p>
+        </w:tc>
+        <w:tc>
+          <w:tcPr>
+            <w:tcW w:type="dxa" w:w="1606"/>
+          </w:tcPr>
+          <w:p>
+            <w:pPr>
+              <w:spacing w:line="240" w:lineRule="auto" w:after="0"/>
+            </w:pPr>
+            <w:r>
+              <w:rPr>
+                <w:rFonts w:ascii="Times New Roman" w:hAnsi="Times New Roman" w:eastAsia="SimSun"/>
+                <w:sz w:val="19"/>
+              </w:rPr>
+              <w:t>0.000</w:t>
+            </w:r>
+          </w:p>
+        </w:tc>
+        <w:tc>
+          <w:tcPr>
+            <w:tcW w:type="dxa" w:w="1606"/>
+          </w:tcPr>
+          <w:p>
+            <w:pPr>
+              <w:spacing w:line="240" w:lineRule="auto" w:after="0"/>
+            </w:pPr>
+            <w:r>
+              <w:rPr>
+                <w:rFonts w:ascii="Times New Roman" w:hAnsi="Times New Roman" w:eastAsia="SimSun"/>
+                <w:sz w:val="19"/>
+              </w:rPr>
+              <w:t>0.000</w:t>
+            </w:r>
+          </w:p>
+        </w:tc>
+        <w:tc>
+          <w:tcPr>
+            <w:tcW w:type="dxa" w:w="1606"/>
+          </w:tcPr>
+          <w:p>
+            <w:pPr>
+              <w:spacing w:line="240" w:lineRule="auto" w:after="0"/>
+            </w:pPr>
+            <w:r>
+              <w:rPr>
+                <w:rFonts w:ascii="Times New Roman" w:hAnsi="Times New Roman" w:eastAsia="SimSun"/>
+                <w:sz w:val="19"/>
+              </w:rPr>
+              <w:t>0.000</w:t>
+            </w:r>
+          </w:p>
+        </w:tc>
+        <w:tc>
+          <w:tcPr>
+            <w:tcW w:type="dxa" w:w="1606"/>
+          </w:tcPr>
+          <w:p>
+            <w:pPr>
+              <w:spacing w:line="240" w:lineRule="auto" w:after="0"/>
+            </w:pPr>
+            <w:r>
+              <w:rPr>
+                <w:rFonts w:ascii="Times New Roman" w:hAnsi="Times New Roman" w:eastAsia="SimSun"/>
+                <w:sz w:val="19"/>
+              </w:rPr>
+              <w:t>0.000</w:t>
+            </w:r>
+          </w:p>
+        </w:tc>
+      </w:tr>
+      <w:tr>
+        <w:tc>
+          <w:tcPr>
+            <w:tcW w:type="dxa" w:w="1606"/>
+          </w:tcPr>
+          <w:p>
+            <w:pPr>
+              <w:spacing w:line="240" w:lineRule="auto" w:after="0"/>
+            </w:pPr>
+            <w:r>
+              <w:rPr>
+                <w:rFonts w:ascii="Times New Roman" w:hAnsi="Times New Roman" w:eastAsia="SimSun"/>
+                <w:sz w:val="19"/>
+              </w:rPr>
+              <w:t>controlled / feature-hash dense</w:t>
+            </w:r>
+          </w:p>
+        </w:tc>
+        <w:tc>
+          <w:tcPr>
+            <w:tcW w:type="dxa" w:w="1606"/>
+          </w:tcPr>
+          <w:p>
+            <w:pPr>
+              <w:spacing w:line="240" w:lineRule="auto" w:after="0"/>
+            </w:pPr>
+            <w:r>
+              <w:rPr>
+                <w:rFonts w:ascii="Times New Roman" w:hAnsi="Times New Roman" w:eastAsia="SimSun"/>
+                <w:sz w:val="19"/>
+              </w:rPr>
+              <w:t>0.000</w:t>
+            </w:r>
+          </w:p>
+        </w:tc>
+        <w:tc>
+          <w:tcPr>
+            <w:tcW w:type="dxa" w:w="1606"/>
+          </w:tcPr>
+          <w:p>
+            <w:pPr>
+              <w:spacing w:line="240" w:lineRule="auto" w:after="0"/>
+            </w:pPr>
+            <w:r>
+              <w:rPr>
+                <w:rFonts w:ascii="Times New Roman" w:hAnsi="Times New Roman" w:eastAsia="SimSun"/>
+                <w:sz w:val="19"/>
+              </w:rPr>
+              <w:t>0.000</w:t>
+            </w:r>
+          </w:p>
+        </w:tc>
+        <w:tc>
+          <w:tcPr>
+            <w:tcW w:type="dxa" w:w="1606"/>
+          </w:tcPr>
+          <w:p>
+            <w:pPr>
+              <w:spacing w:line="240" w:lineRule="auto" w:after="0"/>
+            </w:pPr>
+            <w:r>
+              <w:rPr>
+                <w:rFonts w:ascii="Times New Roman" w:hAnsi="Times New Roman" w:eastAsia="SimSun"/>
+                <w:sz w:val="19"/>
+              </w:rPr>
+              <w:t>0.000</w:t>
+            </w:r>
+          </w:p>
+        </w:tc>
+        <w:tc>
+          <w:tcPr>
+            <w:tcW w:type="dxa" w:w="1606"/>
+          </w:tcPr>
+          <w:p>
+            <w:pPr>
+              <w:spacing w:line="240" w:lineRule="auto" w:after="0"/>
+            </w:pPr>
+            <w:r>
+              <w:rPr>
+                <w:rFonts w:ascii="Times New Roman" w:hAnsi="Times New Roman" w:eastAsia="SimSun"/>
+                <w:sz w:val="19"/>
+              </w:rPr>
+              <w:t>0.000</w:t>
+            </w:r>
+          </w:p>
+        </w:tc>
+        <w:tc>
+          <w:tcPr>
+            <w:tcW w:type="dxa" w:w="1606"/>
+          </w:tcPr>
+          <w:p>
+            <w:pPr>
+              <w:spacing w:line="240" w:lineRule="auto" w:after="0"/>
+            </w:pPr>
+            <w:r>
+              <w:rPr>
+                <w:rFonts w:ascii="Times New Roman" w:hAnsi="Times New Roman" w:eastAsia="SimSun"/>
+                <w:sz w:val="19"/>
+              </w:rPr>
+              <w:t>0.000</w:t>
+            </w:r>
+          </w:p>
+        </w:tc>
+      </w:tr>
+      <w:tr>
+        <w:tc>
+          <w:tcPr>
+            <w:tcW w:type="dxa" w:w="1606"/>
+          </w:tcPr>
+          <w:p>
+            <w:pPr>
+              <w:spacing w:line="240" w:lineRule="auto" w:after="0"/>
+            </w:pPr>
+            <w:r>
+              <w:rPr>
+                <w:rFonts w:ascii="Times New Roman" w:hAnsi="Times New Roman" w:eastAsia="SimSun"/>
+                <w:sz w:val="19"/>
+              </w:rPr>
+              <w:t>BBQ / BM25</w:t>
+            </w:r>
+          </w:p>
+        </w:tc>
+        <w:tc>
+          <w:tcPr>
+            <w:tcW w:type="dxa" w:w="1606"/>
+          </w:tcPr>
+          <w:p>
+            <w:pPr>
+              <w:spacing w:line="240" w:lineRule="auto" w:after="0"/>
+            </w:pPr>
+            <w:r>
+              <w:rPr>
+                <w:rFonts w:ascii="Times New Roman" w:hAnsi="Times New Roman" w:eastAsia="SimSun"/>
+                <w:sz w:val="19"/>
+              </w:rPr>
+              <w:t>0.000</w:t>
+            </w:r>
+          </w:p>
+        </w:tc>
+        <w:tc>
+          <w:tcPr>
+            <w:tcW w:type="dxa" w:w="1606"/>
+          </w:tcPr>
+          <w:p>
+            <w:pPr>
+              <w:spacing w:line="240" w:lineRule="auto" w:after="0"/>
+            </w:pPr>
+            <w:r>
+              <w:rPr>
+                <w:rFonts w:ascii="Times New Roman" w:hAnsi="Times New Roman" w:eastAsia="SimSun"/>
+                <w:sz w:val="19"/>
+              </w:rPr>
+              <w:t>0.000</w:t>
+            </w:r>
+          </w:p>
+        </w:tc>
+        <w:tc>
+          <w:tcPr>
+            <w:tcW w:type="dxa" w:w="1606"/>
+          </w:tcPr>
+          <w:p>
+            <w:pPr>
+              <w:spacing w:line="240" w:lineRule="auto" w:after="0"/>
+            </w:pPr>
+            <w:r>
+              <w:rPr>
+                <w:rFonts w:ascii="Times New Roman" w:hAnsi="Times New Roman" w:eastAsia="SimSun"/>
+                <w:sz w:val="19"/>
+              </w:rPr>
+              <w:t>0.000</w:t>
+            </w:r>
+          </w:p>
+        </w:tc>
+        <w:tc>
+          <w:tcPr>
+            <w:tcW w:type="dxa" w:w="1606"/>
+          </w:tcPr>
+          <w:p>
+            <w:pPr>
+              <w:spacing w:line="240" w:lineRule="auto" w:after="0"/>
+            </w:pPr>
+            <w:r>
+              <w:rPr>
+                <w:rFonts w:ascii="Times New Roman" w:hAnsi="Times New Roman" w:eastAsia="SimSun"/>
+                <w:sz w:val="19"/>
+              </w:rPr>
+              <w:t>0.000</w:t>
+            </w:r>
+          </w:p>
+        </w:tc>
+        <w:tc>
+          <w:tcPr>
+            <w:tcW w:type="dxa" w:w="1606"/>
+          </w:tcPr>
+          <w:p>
+            <w:pPr>
+              <w:spacing w:line="240" w:lineRule="auto" w:after="0"/>
+            </w:pPr>
+            <w:r>
+              <w:rPr>
+                <w:rFonts w:ascii="Times New Roman" w:hAnsi="Times New Roman" w:eastAsia="SimSun"/>
+                <w:sz w:val="19"/>
+              </w:rPr>
+              <w:t>0.000</w:t>
+            </w:r>
+          </w:p>
+        </w:tc>
+      </w:tr>
+      <w:tr>
+        <w:tc>
+          <w:tcPr>
+            <w:tcW w:type="dxa" w:w="1606"/>
+          </w:tcPr>
+          <w:p>
+            <w:pPr>
+              <w:spacing w:line="240" w:lineRule="auto" w:after="0"/>
+            </w:pPr>
+            <w:r>
+              <w:rPr>
+                <w:rFonts w:ascii="Times New Roman" w:hAnsi="Times New Roman" w:eastAsia="SimSun"/>
+                <w:sz w:val="19"/>
+              </w:rPr>
+              <w:t>BBQ / feature-hash dense</w:t>
+            </w:r>
+          </w:p>
+        </w:tc>
+        <w:tc>
+          <w:tcPr>
+            <w:tcW w:type="dxa" w:w="1606"/>
+          </w:tcPr>
+          <w:p>
+            <w:pPr>
+              <w:spacing w:line="240" w:lineRule="auto" w:after="0"/>
+            </w:pPr>
+            <w:r>
+              <w:rPr>
+                <w:rFonts w:ascii="Times New Roman" w:hAnsi="Times New Roman" w:eastAsia="SimSun"/>
+                <w:sz w:val="19"/>
+              </w:rPr>
+              <w:t>0.000</w:t>
+            </w:r>
+          </w:p>
+        </w:tc>
+        <w:tc>
+          <w:tcPr>
+            <w:tcW w:type="dxa" w:w="1606"/>
+          </w:tcPr>
+          <w:p>
+            <w:pPr>
+              <w:spacing w:line="240" w:lineRule="auto" w:after="0"/>
+            </w:pPr>
+            <w:r>
+              <w:rPr>
+                <w:rFonts w:ascii="Times New Roman" w:hAnsi="Times New Roman" w:eastAsia="SimSun"/>
+                <w:sz w:val="19"/>
+              </w:rPr>
+              <w:t>0.000</w:t>
+            </w:r>
+          </w:p>
+        </w:tc>
+        <w:tc>
+          <w:tcPr>
+            <w:tcW w:type="dxa" w:w="1606"/>
+          </w:tcPr>
+          <w:p>
+            <w:pPr>
+              <w:spacing w:line="240" w:lineRule="auto" w:after="0"/>
+            </w:pPr>
+            <w:r>
+              <w:rPr>
+                <w:rFonts w:ascii="Times New Roman" w:hAnsi="Times New Roman" w:eastAsia="SimSun"/>
+                <w:sz w:val="19"/>
+              </w:rPr>
+              <w:t>0.000</w:t>
+            </w:r>
+          </w:p>
+        </w:tc>
+        <w:tc>
+          <w:tcPr>
+            <w:tcW w:type="dxa" w:w="1606"/>
+          </w:tcPr>
+          <w:p>
+            <w:pPr>
+              <w:spacing w:line="240" w:lineRule="auto" w:after="0"/>
+            </w:pPr>
+            <w:r>
+              <w:rPr>
+                <w:rFonts w:ascii="Times New Roman" w:hAnsi="Times New Roman" w:eastAsia="SimSun"/>
+                <w:sz w:val="19"/>
+              </w:rPr>
+              <w:t>0.000</w:t>
+            </w:r>
+          </w:p>
+        </w:tc>
+        <w:tc>
+          <w:tcPr>
+            <w:tcW w:type="dxa" w:w="1606"/>
+          </w:tcPr>
+          <w:p>
+            <w:pPr>
+              <w:spacing w:line="240" w:lineRule="auto" w:after="0"/>
+            </w:pPr>
+            <w:r>
+              <w:rPr>
+                <w:rFonts w:ascii="Times New Roman" w:hAnsi="Times New Roman" w:eastAsia="SimSun"/>
+                <w:sz w:val="19"/>
+              </w:rPr>
+              <w:t>0.000</w:t>
+            </w:r>
+          </w:p>
+        </w:tc>
+      </w:tr>
+      <w:tr>
+        <w:tc>
+          <w:tcPr>
+            <w:tcW w:type="dxa" w:w="1606"/>
+          </w:tcPr>
+          <w:p>
+            <w:pPr>
+              <w:spacing w:line="240" w:lineRule="auto" w:after="0"/>
+            </w:pPr>
+            <w:r>
+              <w:rPr>
+                <w:rFonts w:ascii="Times New Roman" w:hAnsi="Times New Roman" w:eastAsia="SimSun"/>
+                <w:sz w:val="19"/>
+              </w:rPr>
+              <w:t>controlled / GTE-base</w:t>
+            </w:r>
+          </w:p>
+        </w:tc>
+        <w:tc>
+          <w:tcPr>
+            <w:tcW w:type="dxa" w:w="1606"/>
+          </w:tcPr>
+          <w:p>
+            <w:pPr>
+              <w:spacing w:line="240" w:lineRule="auto" w:after="0"/>
+            </w:pPr>
+            <w:r>
+              <w:rPr>
+                <w:rFonts w:ascii="Times New Roman" w:hAnsi="Times New Roman" w:eastAsia="SimSun"/>
+                <w:sz w:val="19"/>
+              </w:rPr>
+              <w:t>0.000</w:t>
+            </w:r>
+          </w:p>
+        </w:tc>
+        <w:tc>
+          <w:tcPr>
+            <w:tcW w:type="dxa" w:w="1606"/>
+          </w:tcPr>
+          <w:p>
+            <w:pPr>
+              <w:spacing w:line="240" w:lineRule="auto" w:after="0"/>
+            </w:pPr>
+            <w:r>
+              <w:rPr>
+                <w:rFonts w:ascii="Times New Roman" w:hAnsi="Times New Roman" w:eastAsia="SimSun"/>
+                <w:sz w:val="19"/>
+              </w:rPr>
+              <w:t>—</w:t>
+            </w:r>
+          </w:p>
+        </w:tc>
+        <w:tc>
+          <w:tcPr>
+            <w:tcW w:type="dxa" w:w="1606"/>
+          </w:tcPr>
+          <w:p>
+            <w:pPr>
+              <w:spacing w:line="240" w:lineRule="auto" w:after="0"/>
+            </w:pPr>
+            <w:r>
+              <w:rPr>
+                <w:rFonts w:ascii="Times New Roman" w:hAnsi="Times New Roman" w:eastAsia="SimSun"/>
+                <w:sz w:val="19"/>
+              </w:rPr>
+              <w:t>—</w:t>
+            </w:r>
+          </w:p>
+        </w:tc>
+        <w:tc>
+          <w:tcPr>
+            <w:tcW w:type="dxa" w:w="1606"/>
+          </w:tcPr>
+          <w:p>
+            <w:pPr>
+              <w:spacing w:line="240" w:lineRule="auto" w:after="0"/>
+            </w:pPr>
+            <w:r>
+              <w:rPr>
+                <w:rFonts w:ascii="Times New Roman" w:hAnsi="Times New Roman" w:eastAsia="SimSun"/>
+                <w:sz w:val="19"/>
+              </w:rPr>
+              <w:t>—</w:t>
+            </w:r>
+          </w:p>
+        </w:tc>
+        <w:tc>
+          <w:tcPr>
+            <w:tcW w:type="dxa" w:w="1606"/>
+          </w:tcPr>
+          <w:p>
+            <w:pPr>
+              <w:spacing w:line="240" w:lineRule="auto" w:after="0"/>
+            </w:pPr>
+            <w:r>
+              <w:rPr>
+                <w:rFonts w:ascii="Times New Roman" w:hAnsi="Times New Roman" w:eastAsia="SimSun"/>
+                <w:sz w:val="19"/>
+              </w:rPr>
+              <w:t>0.000</w:t>
+            </w:r>
+          </w:p>
+        </w:tc>
+      </w:tr>
+      <w:tr>
+        <w:tc>
+          <w:tcPr>
+            <w:tcW w:type="dxa" w:w="1606"/>
+          </w:tcPr>
+          <w:p>
+            <w:pPr>
+              <w:spacing w:line="240" w:lineRule="auto" w:after="0"/>
+            </w:pPr>
+            <w:r>
+              <w:rPr>
+                <w:rFonts w:ascii="Times New Roman" w:hAnsi="Times New Roman" w:eastAsia="SimSun"/>
+                <w:sz w:val="19"/>
+              </w:rPr>
+              <w:t>controlled / Contriever</w:t>
+            </w:r>
+          </w:p>
+        </w:tc>
+        <w:tc>
+          <w:tcPr>
+            <w:tcW w:type="dxa" w:w="1606"/>
+          </w:tcPr>
+          <w:p>
+            <w:pPr>
+              <w:spacing w:line="240" w:lineRule="auto" w:after="0"/>
+            </w:pPr>
+            <w:r>
+              <w:rPr>
+                <w:rFonts w:ascii="Times New Roman" w:hAnsi="Times New Roman" w:eastAsia="SimSun"/>
+                <w:sz w:val="19"/>
+              </w:rPr>
+              <w:t>0.000</w:t>
+            </w:r>
+          </w:p>
+        </w:tc>
+        <w:tc>
+          <w:tcPr>
+            <w:tcW w:type="dxa" w:w="1606"/>
+          </w:tcPr>
+          <w:p>
+            <w:pPr>
+              <w:spacing w:line="240" w:lineRule="auto" w:after="0"/>
+            </w:pPr>
+            <w:r>
+              <w:rPr>
+                <w:rFonts w:ascii="Times New Roman" w:hAnsi="Times New Roman" w:eastAsia="SimSun"/>
+                <w:sz w:val="19"/>
+              </w:rPr>
+              <w:t>—</w:t>
+            </w:r>
+          </w:p>
+        </w:tc>
+        <w:tc>
+          <w:tcPr>
+            <w:tcW w:type="dxa" w:w="1606"/>
+          </w:tcPr>
+          <w:p>
+            <w:pPr>
+              <w:spacing w:line="240" w:lineRule="auto" w:after="0"/>
+            </w:pPr>
+            <w:r>
+              <w:rPr>
+                <w:rFonts w:ascii="Times New Roman" w:hAnsi="Times New Roman" w:eastAsia="SimSun"/>
+                <w:sz w:val="19"/>
+              </w:rPr>
+              <w:t>—</w:t>
+            </w:r>
+          </w:p>
+        </w:tc>
+        <w:tc>
+          <w:tcPr>
+            <w:tcW w:type="dxa" w:w="1606"/>
+          </w:tcPr>
+          <w:p>
+            <w:pPr>
+              <w:spacing w:line="240" w:lineRule="auto" w:after="0"/>
+            </w:pPr>
+            <w:r>
+              <w:rPr>
+                <w:rFonts w:ascii="Times New Roman" w:hAnsi="Times New Roman" w:eastAsia="SimSun"/>
+                <w:sz w:val="19"/>
+              </w:rPr>
+              <w:t>—</w:t>
+            </w:r>
+          </w:p>
+        </w:tc>
+        <w:tc>
+          <w:tcPr>
+            <w:tcW w:type="dxa" w:w="1606"/>
+          </w:tcPr>
+          <w:p>
+            <w:pPr>
+              <w:spacing w:line="240" w:lineRule="auto" w:after="0"/>
+            </w:pPr>
+            <w:r>
+              <w:rPr>
+                <w:rFonts w:ascii="Times New Roman" w:hAnsi="Times New Roman" w:eastAsia="SimSun"/>
+                <w:sz w:val="19"/>
+              </w:rPr>
+              <w:t>0.000</w:t>
+            </w:r>
+          </w:p>
+        </w:tc>
+      </w:tr>
+    </w:tbl>
+    <w:p/>
+    <w:p>
+      <w:r>
+        <w:rPr>
+          <w:rFonts w:ascii="Times New Roman" w:hAnsi="Times New Roman" w:eastAsia="SimSun"/>
+          <w:i/>
+          <w:sz w:val="22"/>
+        </w:rPr>
+        <w:t>(entries are Δ`poison@k`; 0.000 in all 24 measured cells)</w:t>
+      </w:r>
+    </w:p>
+    <w:p>
+      <w:r>
+        <w:rPr>
+          <w:rFonts w:ascii="Times New Roman" w:hAnsi="Times New Roman" w:eastAsia="SimSun"/>
+          <w:sz w:val="22"/>
+        </w:rPr>
+        <w:t xml:space="preserve">Prop. 1 predicts Δ = 0 exactly, and Δ = 0 exactly in every one of the 24 cells measured — not approximately, which a tuning-failure explanation would predict. The equivalence is reproduced by </w:t>
+      </w:r>
+      <w:r>
+        <w:rPr>
+          <w:rFonts w:ascii="Consolas" w:hAnsi="Consolas" w:eastAsia="Consolas"/>
+          <w:sz w:val="21"/>
+        </w:rPr>
+        <w:t>analysis/verify_theory.py</w:t>
+      </w:r>
+      <w:r>
+        <w:rPr>
+          <w:rFonts w:ascii="Times New Roman" w:hAnsi="Times New Roman" w:eastAsia="SimSun"/>
+          <w:sz w:val="22"/>
+        </w:rPr>
+        <w:t xml:space="preserve">. We state the count explicitly because the exactness is the point: the constrained selection is not </w:t>
+      </w:r>
+      <w:r>
+        <w:rPr>
+          <w:rFonts w:ascii="Times New Roman" w:hAnsi="Times New Roman" w:eastAsia="SimSun"/>
+          <w:i/>
+          <w:sz w:val="22"/>
+        </w:rPr>
+        <w:t>near</w:t>
+      </w:r>
+      <w:r>
+        <w:rPr>
+          <w:rFonts w:ascii="Times New Roman" w:hAnsi="Times New Roman" w:eastAsia="SimSun"/>
+          <w:sz w:val="22"/>
+        </w:rPr>
+        <w:t xml:space="preserve"> the reference composition, it </w:t>
+      </w:r>
+      <w:r>
+        <w:rPr>
+          <w:rFonts w:ascii="Times New Roman" w:hAnsi="Times New Roman" w:eastAsia="SimSun"/>
+          <w:i/>
+          <w:sz w:val="22"/>
+        </w:rPr>
+        <w:t>is</w:t>
+      </w:r>
+      <w:r>
+        <w:rPr>
+          <w:rFonts w:ascii="Times New Roman" w:hAnsi="Times New Roman" w:eastAsia="SimSun"/>
+          <w:sz w:val="22"/>
+        </w:rPr>
+        <w:t xml:space="preserve"> the reference composition.</w:t>
       </w:r>
     </w:p>
     <w:p>

</xml_diff>